<commit_message>
Cleanup: remove 12 duplicate documents, unify Opesware branding to EduOS Cameroon
Co-Authored-By: Claude Fable 5 <noreply@anthropic.com>
</commit_message>
<xml_diff>
--- a/NATIONAL DIGITAL EDUCATION MASTER PLAN/EduOS Cameroon National Digital Education Master Plan.docx
+++ b/NATIONAL DIGITAL EDUCATION MASTER PLAN/EduOS Cameroon National Digital Education Master Plan.docx
@@ -60,7 +60,7 @@
           <w:b/>
           <w:bCs/>
         </w:rPr>
-        <w:t xml:space="preserve">Opesware Technologies</w:t>
+        <w:t xml:space="preserve">EduOS Cameroon Technologies</w:t>
       </w:r>
     </w:p>
     <w:p>
@@ -284,7 +284,7 @@
         <w:pStyle w:val="BodyText"/>
       </w:pPr>
       <w:r>
-        <w:t xml:space="preserve">Opesware Technologies</w:t>
+        <w:t xml:space="preserve">EduOS Cameroon Technologies</w:t>
       </w:r>
     </w:p>
     <w:p>

</xml_diff>